<commit_message>
actualizacion archivos de pratica
</commit_message>
<xml_diff>
--- a/ACTIVIDADES/Algoritmo/work/TALLER ALGORITMO 3.docx
+++ b/ACTIVIDADES/Algoritmo/work/TALLER ALGORITMO 3.docx
@@ -765,6 +765,7 @@
         <w:rPr>
           <w:b/>
           <w:bCs/>
+          <w:noProof/>
           <w:lang w:val="es-ES"/>
         </w:rPr>
         <w:drawing>
@@ -869,6 +870,7 @@
       </w:pPr>
       <w:r>
         <w:rPr>
+          <w:noProof/>
           <w:lang w:val="es-ES"/>
         </w:rPr>
         <w:drawing>
@@ -943,6 +945,7 @@
       </w:pPr>
       <w:r>
         <w:rPr>
+          <w:noProof/>
           <w:lang w:val="es-ES"/>
         </w:rPr>
         <w:drawing>
@@ -1003,6 +1006,7 @@
       </w:pPr>
       <w:r>
         <w:rPr>
+          <w:noProof/>
           <w:lang w:val="es-ES"/>
         </w:rPr>
         <w:drawing>
@@ -1098,6 +1102,7 @@
       </w:pPr>
       <w:r>
         <w:rPr>
+          <w:noProof/>
           <w:lang w:val="es-ES"/>
         </w:rPr>
         <w:drawing>
@@ -1135,6 +1140,108 @@
             </a:graphic>
           </wp:inline>
         </w:drawing>
+      </w:r>
+    </w:p>
+    <w:p>
+      <w:pPr>
+        <w:rPr>
+          <w:lang w:val="es-ES"/>
+        </w:rPr>
+      </w:pPr>
+    </w:p>
+    <w:p>
+      <w:pPr>
+        <w:rPr>
+          <w:lang w:val="es-ES"/>
+        </w:rPr>
+      </w:pPr>
+      <w:r>
+        <w:rPr>
+          <w:lang w:val="es-ES"/>
+        </w:rPr>
+        <w:br w:type="page"/>
+      </w:r>
+    </w:p>
+    <w:p>
+      <w:pPr>
+        <w:rPr>
+          <w:lang w:val="es-ES"/>
+        </w:rPr>
+      </w:pPr>
+      <w:r>
+        <w:rPr>
+          <w:lang w:val="es-ES"/>
+        </w:rPr>
+        <w:lastRenderedPageBreak/>
+        <w:drawing>
+          <wp:anchor distT="0" distB="0" distL="114300" distR="114300" simplePos="0" relativeHeight="251662336" behindDoc="1" locked="0" layoutInCell="1" allowOverlap="1" wp14:anchorId="0574CDD9" wp14:editId="080E602D">
+            <wp:simplePos x="0" y="0"/>
+            <wp:positionH relativeFrom="column">
+              <wp:posOffset>219973</wp:posOffset>
+            </wp:positionH>
+            <wp:positionV relativeFrom="paragraph">
+              <wp:posOffset>223</wp:posOffset>
+            </wp:positionV>
+            <wp:extent cx="4126230" cy="8258810"/>
+            <wp:effectExtent l="0" t="0" r="7620" b="8890"/>
+            <wp:wrapTight wrapText="bothSides">
+              <wp:wrapPolygon edited="0">
+                <wp:start x="0" y="0"/>
+                <wp:lineTo x="0" y="21573"/>
+                <wp:lineTo x="21540" y="21573"/>
+                <wp:lineTo x="21540" y="0"/>
+                <wp:lineTo x="0" y="0"/>
+              </wp:wrapPolygon>
+            </wp:wrapTight>
+            <wp:docPr id="1521363254" name="Imagen 1"/>
+            <wp:cNvGraphicFramePr>
+              <a:graphicFrameLocks xmlns:a="http://schemas.openxmlformats.org/drawingml/2006/main" noChangeAspect="1"/>
+            </wp:cNvGraphicFramePr>
+            <a:graphic xmlns:a="http://schemas.openxmlformats.org/drawingml/2006/main">
+              <a:graphicData uri="http://schemas.openxmlformats.org/drawingml/2006/picture">
+                <pic:pic xmlns:pic="http://schemas.openxmlformats.org/drawingml/2006/picture">
+                  <pic:nvPicPr>
+                    <pic:cNvPr id="1521363254" name=""/>
+                    <pic:cNvPicPr/>
+                  </pic:nvPicPr>
+                  <pic:blipFill>
+                    <a:blip r:embed="rId16">
+                      <a:extLst>
+                        <a:ext uri="{28A0092B-C50C-407E-A947-70E740481C1C}">
+                          <a14:useLocalDpi xmlns:a14="http://schemas.microsoft.com/office/drawing/2010/main" val="0"/>
+                        </a:ext>
+                      </a:extLst>
+                    </a:blip>
+                    <a:stretch>
+                      <a:fillRect/>
+                    </a:stretch>
+                  </pic:blipFill>
+                  <pic:spPr>
+                    <a:xfrm>
+                      <a:off x="0" y="0"/>
+                      <a:ext cx="4126230" cy="8258810"/>
+                    </a:xfrm>
+                    <a:prstGeom prst="rect">
+                      <a:avLst/>
+                    </a:prstGeom>
+                  </pic:spPr>
+                </pic:pic>
+              </a:graphicData>
+            </a:graphic>
+            <wp14:sizeRelH relativeFrom="page">
+              <wp14:pctWidth>0</wp14:pctWidth>
+            </wp14:sizeRelH>
+            <wp14:sizeRelV relativeFrom="page">
+              <wp14:pctHeight>0</wp14:pctHeight>
+            </wp14:sizeRelV>
+          </wp:anchor>
+        </w:drawing>
+      </w:r>
+      <w:r>
+        <w:rPr>
+          <w:lang w:val="es-ES"/>
+        </w:rPr>
+        <w:t>8</w:t>
       </w:r>
     </w:p>
     <w:p>
@@ -1777,6 +1884,7 @@
   <w:style w:type="character" w:default="1" w:styleId="Fuentedeprrafopredeter">
     <w:name w:val="Default Paragraph Font"/>
     <w:uiPriority w:val="1"/>
+    <w:semiHidden/>
     <w:unhideWhenUsed/>
   </w:style>
   <w:style w:type="table" w:default="1" w:styleId="Tablanormal">

</xml_diff>